<commit_message>
docs: file added The database
</commit_message>
<xml_diff>
--- a/Linux Basic Commands.docx
+++ b/Linux Basic Commands.docx
@@ -1,6 +1,6 @@
 
 <file path=word/document.xml><?xml version="1.0" encoding="utf-8"?>
-<w:document xmlns:wpc="http://schemas.microsoft.com/office/word/2010/wordprocessingCanvas" xmlns:cx="http://schemas.microsoft.com/office/drawing/2014/chartex" xmlns:cx1="http://schemas.microsoft.com/office/drawing/2015/9/8/chartex" xmlns:cx2="http://schemas.microsoft.com/office/drawing/2015/10/21/chartex" xmlns:cx3="http://schemas.microsoft.com/office/drawing/2016/5/9/chartex" xmlns:cx4="http://schemas.microsoft.com/office/drawing/2016/5/10/chartex" xmlns:cx5="http://schemas.microsoft.com/office/drawing/2016/5/11/chartex" xmlns:cx6="http://schemas.microsoft.com/office/drawing/2016/5/12/chartex" xmlns:cx7="http://schemas.microsoft.com/office/drawing/2016/5/13/chartex" xmlns:cx8="http://schemas.microsoft.com/office/drawing/2016/5/14/chartex" xmlns:mc="http://schemas.openxmlformats.org/markup-compatibility/2006" xmlns:aink="http://schemas.microsoft.com/office/drawing/2016/ink" xmlns:am3d="http://schemas.microsoft.com/office/drawing/2017/model3d" xmlns:o="urn:schemas-microsoft-com:office:office" xmlns:oel="http://schemas.microsoft.com/office/2019/extlst" xmlns:r="http://schemas.openxmlformats.org/officeDocument/2006/relationships" xmlns:m="http://schemas.openxmlformats.org/officeDocument/2006/math" xmlns:v="urn:schemas-microsoft-com:vml" xmlns:wp14="http://schemas.microsoft.com/office/word/2010/wordprocessingDrawing" xmlns:wp="http://schemas.openxmlformats.org/drawingml/2006/wordprocessingDrawing" xmlns:w10="urn:schemas-microsoft-com:office:word" xmlns:w="http://schemas.openxmlformats.org/wordprocessingml/2006/main" xmlns:w14="http://schemas.microsoft.com/office/word/2010/wordml" xmlns:w15="http://schemas.microsoft.com/office/word/2012/wordml" xmlns:w16cex="http://schemas.microsoft.com/office/word/2018/wordml/cex" xmlns:w16cid="http://schemas.microsoft.com/office/word/2016/wordml/cid" xmlns:w16="http://schemas.microsoft.com/office/word/2018/wordml" xmlns:w16du="http://schemas.microsoft.com/office/word/2023/wordml/word16du" xmlns:w16sdtdh="http://schemas.microsoft.com/office/word/2020/wordml/sdtdatahash" xmlns:w16sdtfl="http://schemas.microsoft.com/office/word/2024/wordml/sdtformatlock" xmlns:w16se="http://schemas.microsoft.com/office/word/2015/wordml/symex" xmlns:wpg="http://schemas.microsoft.com/office/word/2010/wordprocessingGroup" xmlns:wpi="http://schemas.microsoft.com/office/word/2010/wordprocessingInk" xmlns:wne="http://schemas.microsoft.com/office/word/2006/wordml" xmlns:wps="http://schemas.microsoft.com/office/word/2010/wordprocessingShape" mc:Ignorable="w14 w15 w16se w16cid w16 w16cex w16sdtdh w16sdtfl w16du wp14">
+<w:document xmlns:wpc="http://schemas.microsoft.com/office/word/2010/wordprocessingCanvas" xmlns:cx="http://schemas.microsoft.com/office/drawing/2014/chartex" xmlns:cx1="http://schemas.microsoft.com/office/drawing/2015/9/8/chartex" xmlns:cx2="http://schemas.microsoft.com/office/drawing/2015/10/21/chartex" xmlns:cx3="http://schemas.microsoft.com/office/drawing/2016/5/9/chartex" xmlns:cx4="http://schemas.microsoft.com/office/drawing/2016/5/10/chartex" xmlns:cx5="http://schemas.microsoft.com/office/drawing/2016/5/11/chartex" xmlns:cx6="http://schemas.microsoft.com/office/drawing/2016/5/12/chartex" xmlns:cx7="http://schemas.microsoft.com/office/drawing/2016/5/13/chartex" xmlns:cx8="http://schemas.microsoft.com/office/drawing/2016/5/14/chartex" xmlns:mc="http://schemas.openxmlformats.org/markup-compatibility/2006" xmlns:m="http://schemas.openxmlformats.org/officeDocument/2006/math" xmlns:aink="http://schemas.microsoft.com/office/drawing/2016/ink" xmlns:am3d="http://schemas.microsoft.com/office/drawing/2017/model3d" xmlns:oel="http://schemas.microsoft.com/office/2019/extlst" xmlns:r="http://schemas.openxmlformats.org/officeDocument/2006/relationships" xmlns:wp14="http://schemas.microsoft.com/office/word/2010/wordprocessingDrawing" xmlns:wp="http://schemas.openxmlformats.org/drawingml/2006/wordprocessingDrawing" xmlns:wpg="http://schemas.microsoft.com/office/word/2010/wordprocessingGroup" xmlns:wpi="http://schemas.microsoft.com/office/word/2010/wordprocessingInk" xmlns:wps="http://schemas.microsoft.com/office/word/2010/wordprocessingShape" xmlns:o="urn:schemas-microsoft-com:office:office" xmlns:v="urn:schemas-microsoft-com:vml" xmlns:w10="urn:schemas-microsoft-com:office:word" xmlns:w="http://schemas.openxmlformats.org/wordprocessingml/2006/main" xmlns:w14="http://schemas.microsoft.com/office/word/2010/wordml" xmlns:w15="http://schemas.microsoft.com/office/word/2012/wordml" xmlns:w16cei="http://schemas.microsoft.com/office/word/2026/wordml/cei" xmlns:w16cex="http://schemas.microsoft.com/office/word/2018/wordml/cex" xmlns:w16cid="http://schemas.microsoft.com/office/word/2016/wordml/cid" xmlns:w16="http://schemas.microsoft.com/office/word/2018/wordml" xmlns:w16sdtdh="http://schemas.microsoft.com/office/word/2020/wordml/sdtdatahash" xmlns:w16sdtfl="http://schemas.microsoft.com/office/word/2024/wordml/sdtformatlock" xmlns:w16se="http://schemas.microsoft.com/office/word/2015/wordml/symex" xmlns:w16du="http://schemas.microsoft.com/office/word/2023/wordml/word16du" xmlns:wne="http://schemas.microsoft.com/office/word/2006/wordml" mc:Ignorable="w14 w15 w16se w16cid w16 w16cex w16sdtdh w16sdtfl w16du wp14">
   <w:body>
     <w:p>
       <w:pPr>
@@ -13,16 +13,30 @@
     </w:p>
     <w:p>
       <w:pPr>
+        <w:rPr>
+          <w:rFonts w:ascii="Arial" w:hAnsi="Arial" w:cs="Arial"/>
+          <w:b/>
+          <w:bCs/>
+          <w:sz w:val="24"/>
+        </w:rPr>
+      </w:pPr>
+      <w:r>
+        <w:rPr>
+          <w:rFonts w:ascii="Arial" w:hAnsi="Arial" w:cs="Arial"/>
+          <w:b/>
+          <w:bCs/>
+          <w:sz w:val="24"/>
+        </w:rPr>
+        <w:t>Resources From UAMY.CP5.1x: DevOps: Foundations and tools Universidades Anahuac</w:t>
+      </w:r>
+    </w:p>
+    <w:p>
+      <w:pPr>
         <w:pStyle w:val="Heading3"/>
       </w:pPr>
       <w:r>
-        <w:t xml:space="preserve">- </w:t>
-      </w:r>
-      <w:proofErr w:type="spellStart"/>
-      <w:r>
-        <w:t>pwd</w:t>
-      </w:r>
-      <w:proofErr w:type="spellEnd"/>
+        <w:t>- pwd</w:t>
+      </w:r>
     </w:p>
     <w:p>
       <w:r>
@@ -412,49 +426,15 @@
       </w:pPr>
     </w:p>
     <w:p>
-      <w:r>
-        <w:t xml:space="preserve">As you can see from above. The first line first character starts with a </w:t>
-      </w:r>
-      <w:proofErr w:type="gramStart"/>
-      <w:r>
-        <w:t>d ,</w:t>
-      </w:r>
-      <w:proofErr w:type="gramEnd"/>
-      <w:r>
-        <w:t xml:space="preserve"> which means it is a directory, the second line starts with a </w:t>
-      </w:r>
-      <w:proofErr w:type="gramStart"/>
-      <w:r>
-        <w:t>dash ,</w:t>
-      </w:r>
-      <w:proofErr w:type="gramEnd"/>
-      <w:r>
-        <w:t xml:space="preserve"> which means it is a file. Sometimes it starts with a “l</w:t>
-      </w:r>
-      <w:proofErr w:type="gramStart"/>
-      <w:r>
-        <w:t>” ,</w:t>
-      </w:r>
-      <w:proofErr w:type="gramEnd"/>
-      <w:r>
-        <w:t xml:space="preserve"> which means this is a symbolic link. </w:t>
-      </w:r>
-    </w:p>
-    <w:p>
-      <w:pPr>
-        <w:rPr>
-          <w:b/>
-          <w:bCs/>
-        </w:rPr>
-      </w:pPr>
-    </w:p>
-    <w:p>
-      <w:pPr>
-        <w:rPr>
-          <w:b/>
-          <w:bCs/>
-        </w:rPr>
-      </w:pPr>
+      <w:pPr>
+        <w:rPr>
+          <w:b/>
+          <w:bCs/>
+        </w:rPr>
+      </w:pPr>
+      <w:r>
+        <w:t>As you can see from above. The first line first character starts with a d , which means it is a directory, the second line starts with a dash , which means it is a file. Sometimes it starts with a “l” , which means this is a symbolic link.</w:t>
+      </w:r>
       <w:r>
         <w:rPr>
           <w:b/>
@@ -623,15 +603,7 @@
     </w:p>
     <w:p>
       <w:r>
-        <w:t xml:space="preserve">Creates a file that does not </w:t>
-      </w:r>
-      <w:proofErr w:type="gramStart"/>
-      <w:r>
-        <w:t>exists</w:t>
-      </w:r>
-      <w:proofErr w:type="gramEnd"/>
-      <w:r>
-        <w:t>, if exits updates the timestamp of the last modification.</w:t>
+        <w:t>Creates a file that does not exists, if exits updates the timestamp of the last modification.</w:t>
       </w:r>
     </w:p>
     <w:p/>
@@ -664,15 +636,7 @@
     </w:p>
     <w:p>
       <w:r>
-        <w:t xml:space="preserve">When a user creates a </w:t>
-      </w:r>
-      <w:proofErr w:type="gramStart"/>
-      <w:r>
-        <w:t>group ,</w:t>
-      </w:r>
-      <w:proofErr w:type="gramEnd"/>
-      <w:r>
-        <w:t xml:space="preserve"> it will be assigned </w:t>
+        <w:t xml:space="preserve">When a user creates a group , it will be assigned </w:t>
       </w:r>
     </w:p>
     <w:p/>
@@ -717,7 +681,15 @@
       </w:r>
       <w:proofErr w:type="gramEnd"/>
       <w:r>
-        <w:t xml:space="preserve"> illustrate the File or directory permissions, lets create a text file “text.txt” in “D” drive.</w:t>
+        <w:t xml:space="preserve"> illustrate the File or directory permissions, </w:t>
+      </w:r>
+      <w:proofErr w:type="gramStart"/>
+      <w:r>
+        <w:t>lets</w:t>
+      </w:r>
+      <w:proofErr w:type="gramEnd"/>
+      <w:r>
+        <w:t xml:space="preserve"> create a text file “text.txt” in “D” drive.</w:t>
       </w:r>
     </w:p>
     <w:p>
@@ -755,15 +727,7 @@
         <w:jc w:val="left"/>
       </w:pPr>
       <w:r>
-        <w:t xml:space="preserve">Please take </w:t>
-      </w:r>
-      <w:proofErr w:type="gramStart"/>
-      <w:r>
-        <w:t>a note</w:t>
-      </w:r>
-      <w:proofErr w:type="gramEnd"/>
-      <w:r>
-        <w:t xml:space="preserve"> about the slash, it must be a </w:t>
+        <w:t xml:space="preserve">Please take a note about the slash, it must be a </w:t>
       </w:r>
       <w:r>
         <w:rPr>
@@ -1021,24 +985,16 @@
     </w:p>
     <w:p>
       <w:r>
-        <w:t xml:space="preserve">As you can see from above, the first character of the permission column starts with a dash, which means this is a file not </w:t>
-      </w:r>
+        <w:t xml:space="preserve">As you can see from above, the first character of the permission column starts with a dash, which means this is a file not directory or symbolic link. </w:t>
+      </w:r>
+      <w:proofErr w:type="spellStart"/>
       <w:proofErr w:type="gramStart"/>
       <w:r>
-        <w:t>directory</w:t>
-      </w:r>
+        <w:t>Lets</w:t>
+      </w:r>
+      <w:proofErr w:type="spellEnd"/>
       <w:proofErr w:type="gramEnd"/>
       <w:r>
-        <w:t xml:space="preserve"> or symbolic link. </w:t>
-      </w:r>
-      <w:proofErr w:type="spellStart"/>
-      <w:proofErr w:type="gramStart"/>
-      <w:r>
-        <w:t>Lets</w:t>
-      </w:r>
-      <w:proofErr w:type="spellEnd"/>
-      <w:proofErr w:type="gramEnd"/>
-      <w:r>
         <w:t xml:space="preserve"> deal with the permission column first. </w:t>
       </w:r>
     </w:p>
@@ -1082,14 +1038,9 @@
       <w:r>
         <w:t xml:space="preserve">) - Second group are permissions that apply to the group where the user belongs to, that is </w:t>
       </w:r>
-      <w:proofErr w:type="gramStart"/>
-      <w:r>
-        <w:tab/>
-        <w:t xml:space="preserve">  the</w:t>
-      </w:r>
-      <w:proofErr w:type="gramEnd"/>
-      <w:r>
-        <w:t xml:space="preserve"> third column</w:t>
+      <w:r>
+        <w:tab/>
+        <w:t xml:space="preserve">  the third column</w:t>
       </w:r>
     </w:p>
     <w:p>
@@ -1240,7 +1191,6 @@
         </w:rPr>
         <w:tab/>
       </w:r>
-      <w:proofErr w:type="gramStart"/>
       <w:r>
         <w:rPr>
           <w:sz w:val="84"/>
@@ -1249,7 +1199,6 @@
         <w:tab/>
         <w:t xml:space="preserve">  w</w:t>
       </w:r>
-      <w:proofErr w:type="gramEnd"/>
       <w:r>
         <w:rPr>
           <w:sz w:val="84"/>
@@ -1257,7 +1206,6 @@
         </w:rPr>
         <w:tab/>
       </w:r>
-      <w:proofErr w:type="gramStart"/>
       <w:r>
         <w:rPr>
           <w:sz w:val="84"/>
@@ -1266,7 +1214,6 @@
         <w:tab/>
         <w:t xml:space="preserve">  x</w:t>
       </w:r>
-      <w:proofErr w:type="gramEnd"/>
     </w:p>
     <w:p>
       <w:pPr>
@@ -1454,65 +1401,41 @@
         <w:jc w:val="left"/>
       </w:pPr>
       <w:r>
-        <w:t xml:space="preserve">For the above, as you can see each single character, has the base of 2 </w:t>
+        <w:t>For the above, as you can see each single character, has the base of 2 and to the power of 0, 1, 2.</w:t>
+      </w:r>
+    </w:p>
+    <w:p>
+      <w:pPr>
+        <w:jc w:val="left"/>
+      </w:pPr>
+      <w:r>
+        <w:t xml:space="preserve">Power of 0 must be “x”, power of 1 must be “w” and the last power of 2 is “r”. </w:t>
       </w:r>
       <w:proofErr w:type="gramStart"/>
       <w:r>
-        <w:t>and to</w:t>
+        <w:t>Therefore</w:t>
       </w:r>
       <w:proofErr w:type="gramEnd"/>
       <w:r>
-        <w:t xml:space="preserve"> the power of 0, 1, 2.</w:t>
-      </w:r>
-    </w:p>
-    <w:p>
-      <w:pPr>
-        <w:jc w:val="left"/>
-      </w:pPr>
-      <w:r>
-        <w:t xml:space="preserve">Power of 0 must be “x”, power of 1 must be “w” and the last power of 2 is “r”. </w:t>
+        <w:t xml:space="preserve"> </w:t>
+      </w:r>
+      <w:r>
+        <w:rPr>
+          <w:b/>
+          <w:bCs/>
+        </w:rPr>
+        <w:t>order matters</w:t>
+      </w:r>
+      <w:r>
+        <w:t xml:space="preserve">. For </w:t>
       </w:r>
       <w:proofErr w:type="gramStart"/>
       <w:r>
-        <w:t>Therefore</w:t>
+        <w:t>instance</w:t>
       </w:r>
       <w:proofErr w:type="gramEnd"/>
       <w:r>
-        <w:t xml:space="preserve"> </w:t>
-      </w:r>
-      <w:r>
-        <w:rPr>
-          <w:b/>
-          <w:bCs/>
-        </w:rPr>
-        <w:t>order matters</w:t>
-      </w:r>
-      <w:r>
-        <w:t xml:space="preserve">. For </w:t>
-      </w:r>
-      <w:proofErr w:type="gramStart"/>
-      <w:r>
-        <w:t>instance</w:t>
-      </w:r>
-      <w:proofErr w:type="gramEnd"/>
-      <w:r>
-        <w:t xml:space="preserve"> if we want to grant all access (</w:t>
-      </w:r>
-      <w:proofErr w:type="gramStart"/>
-      <w:r>
-        <w:t>read ,</w:t>
-      </w:r>
-      <w:proofErr w:type="gramEnd"/>
-      <w:r>
-        <w:t xml:space="preserve"> write, execute) of a file to a user. We just need to add all the numbers together. That is 4 + 2 + </w:t>
-      </w:r>
-      <w:proofErr w:type="gramStart"/>
-      <w:r>
-        <w:t>1 ,</w:t>
-      </w:r>
-      <w:proofErr w:type="gramEnd"/>
-      <w:r>
-        <w:t xml:space="preserve"> which gives the result is 7. That means full access is 7. Now back to above, if we just need to grant “read” and “execute” </w:t>
+        <w:t xml:space="preserve"> if we want to grant all access (read , write, execute) of a file to a user. We just need to add all the numbers together. That is 4 + 2 + 1 , which gives the result is 7. That means full access is 7. Now back to above, if we just need to grant “read” and “execute” </w:t>
       </w:r>
       <w:proofErr w:type="gramStart"/>
       <w:r>
@@ -1564,7 +1487,6 @@
         </w:rPr>
         <w:tab/>
       </w:r>
-      <w:proofErr w:type="gramStart"/>
       <w:r>
         <w:rPr>
           <w:sz w:val="84"/>
@@ -1573,7 +1495,6 @@
         <w:tab/>
         <w:t xml:space="preserve">  w</w:t>
       </w:r>
-      <w:proofErr w:type="gramEnd"/>
       <w:r>
         <w:rPr>
           <w:sz w:val="84"/>
@@ -1581,7 +1502,6 @@
         </w:rPr>
         <w:tab/>
       </w:r>
-      <w:proofErr w:type="gramStart"/>
       <w:r>
         <w:rPr>
           <w:sz w:val="84"/>
@@ -1590,7 +1510,6 @@
         <w:tab/>
         <w:t xml:space="preserve">  x</w:t>
       </w:r>
-      <w:proofErr w:type="gramEnd"/>
     </w:p>
     <w:p>
       <w:pPr>
@@ -1781,45 +1700,13 @@
     <w:p/>
     <w:p>
       <w:r>
-        <w:t>For read is “4</w:t>
-      </w:r>
-      <w:proofErr w:type="gramStart"/>
-      <w:r>
-        <w:t>” ,</w:t>
-      </w:r>
-      <w:proofErr w:type="gramEnd"/>
-      <w:r>
-        <w:t xml:space="preserve"> write is zero (as we want to revoke this privilege) and the last execute is “1”. Now by adding the numbers (4 + 0 + 1), we will get a number 5.</w:t>
-      </w:r>
-    </w:p>
-    <w:p/>
-    <w:p>
-      <w:r>
-        <w:t xml:space="preserve">This formula applies to all 3 specific </w:t>
-      </w:r>
-      <w:proofErr w:type="gramStart"/>
-      <w:r>
-        <w:t>groups ,</w:t>
-      </w:r>
-      <w:proofErr w:type="gramEnd"/>
-      <w:r>
-        <w:t xml:space="preserve"> </w:t>
-      </w:r>
-      <w:proofErr w:type="gramStart"/>
-      <w:r>
-        <w:t>which is user</w:t>
-      </w:r>
-      <w:proofErr w:type="gramEnd"/>
-      <w:r>
-        <w:t xml:space="preserve">, group </w:t>
-      </w:r>
-      <w:proofErr w:type="gramStart"/>
-      <w:r>
-        <w:t>owner</w:t>
-      </w:r>
-      <w:proofErr w:type="gramEnd"/>
-      <w:r>
-        <w:t xml:space="preserve"> and everybody group. That means </w:t>
+        <w:t>For read is “4” , write is zero (as we want to revoke this privilege) and the last execute is “1”. Now by adding the numbers (4 + 0 + 1), we will get a number 5.</w:t>
+      </w:r>
+    </w:p>
+    <w:p/>
+    <w:p>
+      <w:r>
+        <w:t xml:space="preserve">This formula applies to all 3 specific groups , which is user, group owner and everybody group. That means </w:t>
       </w:r>
       <w:proofErr w:type="gramStart"/>
       <w:r>
@@ -1880,7 +1767,6 @@
         </w:rPr>
         <w:tab/>
       </w:r>
-      <w:proofErr w:type="gramStart"/>
       <w:r>
         <w:rPr>
           <w:sz w:val="84"/>
@@ -1889,7 +1775,6 @@
         <w:tab/>
         <w:t xml:space="preserve">  7</w:t>
       </w:r>
-      <w:proofErr w:type="gramEnd"/>
     </w:p>
     <w:p>
       <w:pPr>
@@ -2033,87 +1918,51 @@
           <w:szCs w:val="21"/>
         </w:rPr>
         <w:lastRenderedPageBreak/>
-        <w:t xml:space="preserve">The reason is for </w:t>
+        <w:t xml:space="preserve">The reason is for read only, that is the base 2 to the power of 2 becomes 4. And the others </w:t>
       </w:r>
       <w:proofErr w:type="gramStart"/>
       <w:r>
         <w:rPr>
           <w:szCs w:val="21"/>
         </w:rPr>
-        <w:t>read</w:t>
+        <w:t>is</w:t>
       </w:r>
       <w:proofErr w:type="gramEnd"/>
       <w:r>
         <w:rPr>
           <w:szCs w:val="21"/>
         </w:rPr>
-        <w:t xml:space="preserve"> only, that is the base 2 to the power of 2 becomes 4. And the others </w:t>
-      </w:r>
-      <w:proofErr w:type="gramStart"/>
-      <w:r>
+        <w:t xml:space="preserve"> zeros (revoke access). By adding (4 + 0 + 0) becomes 4.</w:t>
+      </w:r>
+    </w:p>
+    <w:p>
+      <w:pPr>
+        <w:jc w:val="left"/>
         <w:rPr>
           <w:szCs w:val="21"/>
         </w:rPr>
-        <w:t>is</w:t>
-      </w:r>
-      <w:proofErr w:type="gramEnd"/>
-      <w:r>
+      </w:pPr>
+    </w:p>
+    <w:p>
+      <w:pPr>
+        <w:jc w:val="left"/>
         <w:rPr>
           <w:szCs w:val="21"/>
         </w:rPr>
-        <w:t xml:space="preserve"> zeros (revoke access). By adding (4 + 0 + 0) </w:t>
-      </w:r>
-      <w:proofErr w:type="gramStart"/>
-      <w:r>
+      </w:pPr>
+    </w:p>
+    <w:p>
+      <w:pPr>
+        <w:jc w:val="left"/>
         <w:rPr>
           <w:szCs w:val="21"/>
         </w:rPr>
-        <w:t>becomes</w:t>
-      </w:r>
-      <w:proofErr w:type="gramEnd"/>
+      </w:pPr>
       <w:r>
         <w:rPr>
           <w:szCs w:val="21"/>
         </w:rPr>
-        <w:t xml:space="preserve"> 4.</w:t>
-      </w:r>
-    </w:p>
-    <w:p>
-      <w:pPr>
-        <w:jc w:val="left"/>
-        <w:rPr>
-          <w:szCs w:val="21"/>
-        </w:rPr>
-      </w:pPr>
-    </w:p>
-    <w:p>
-      <w:pPr>
-        <w:jc w:val="left"/>
-        <w:rPr>
-          <w:szCs w:val="21"/>
-        </w:rPr>
-      </w:pPr>
-    </w:p>
-    <w:p>
-      <w:pPr>
-        <w:jc w:val="left"/>
-        <w:rPr>
-          <w:szCs w:val="21"/>
-        </w:rPr>
-      </w:pPr>
-      <w:proofErr w:type="gramStart"/>
-      <w:r>
-        <w:rPr>
-          <w:szCs w:val="21"/>
-        </w:rPr>
-        <w:t>Remind</w:t>
-      </w:r>
-      <w:proofErr w:type="gramEnd"/>
-      <w:r>
-        <w:rPr>
-          <w:szCs w:val="21"/>
-        </w:rPr>
-        <w:t xml:space="preserve"> you don’t forget the order:</w:t>
+        <w:t>Remind you don’t forget the order:</w:t>
       </w:r>
     </w:p>
     <w:p>
@@ -2312,15 +2161,7 @@
         <w:t xml:space="preserve">dash </w:t>
       </w:r>
       <w:r>
-        <w:t xml:space="preserve">sign means the permission is being </w:t>
-      </w:r>
-      <w:proofErr w:type="gramStart"/>
-      <w:r>
-        <w:t>revoke</w:t>
-      </w:r>
-      <w:proofErr w:type="gramEnd"/>
-      <w:r>
-        <w:t xml:space="preserve"> or does not have gain this permission. </w:t>
+        <w:t xml:space="preserve">sign means the permission is being revoke or does not have gain this permission. </w:t>
       </w:r>
     </w:p>
     <w:p/>
@@ -2522,7 +2363,6 @@
           <w:bCs/>
         </w:rPr>
       </w:pPr>
-      <w:proofErr w:type="gramStart"/>
       <w:r>
         <w:rPr>
           <w:b/>
@@ -2539,7 +2379,6 @@
         <w:t>-</w:t>
       </w:r>
       <w:proofErr w:type="spellStart"/>
-      <w:proofErr w:type="gramEnd"/>
       <w:r>
         <w:rPr>
           <w:b/>
@@ -2592,32 +2431,15 @@
       <w:r>
         <w:t xml:space="preserve">-”. Talking about </w:t>
       </w:r>
-      <w:proofErr w:type="gramStart"/>
-      <w:r>
-        <w:rPr>
-          <w:b/>
-          <w:bCs/>
-        </w:rPr>
-        <w:t>execute</w:t>
-      </w:r>
-      <w:proofErr w:type="gramEnd"/>
-      <w:r>
-        <w:rPr>
-          <w:b/>
-          <w:bCs/>
-        </w:rPr>
-        <w:t xml:space="preserve"> </w:t>
-      </w:r>
-      <w:r>
-        <w:t xml:space="preserve">privilege, means it cannot be run or </w:t>
-      </w:r>
-      <w:proofErr w:type="gramStart"/>
-      <w:r>
-        <w:t>compile</w:t>
-      </w:r>
-      <w:proofErr w:type="gramEnd"/>
-      <w:r>
-        <w:t xml:space="preserve"> as program, or even open the file for editing. </w:t>
+      <w:r>
+        <w:rPr>
+          <w:b/>
+          <w:bCs/>
+        </w:rPr>
+        <w:t xml:space="preserve">execute </w:t>
+      </w:r>
+      <w:r>
+        <w:t xml:space="preserve">privilege, means it cannot be run or compile as program, or even open the file for editing. </w:t>
       </w:r>
     </w:p>
     <w:p/>
@@ -2670,34 +2492,14 @@
       </w:r>
       <w:proofErr w:type="spellEnd"/>
       <w:r>
-        <w:t>, however</w:t>
-      </w:r>
-      <w:proofErr w:type="gramStart"/>
-      <w:r>
-        <w:t>, the difference</w:t>
-      </w:r>
-      <w:proofErr w:type="gramEnd"/>
-      <w:r>
-        <w:t xml:space="preserve"> is this time you are not assigning numbers, instead a bunch </w:t>
-      </w:r>
-      <w:proofErr w:type="gramStart"/>
-      <w:r>
-        <w:t xml:space="preserve">of </w:t>
-      </w:r>
-      <w:r>
-        <w:rPr>
-          <w:b/>
-          <w:bCs/>
-        </w:rPr>
-        <w:t>letters</w:t>
-      </w:r>
-      <w:proofErr w:type="gramEnd"/>
-      <w:r>
-        <w:rPr>
-          <w:b/>
-          <w:bCs/>
-        </w:rPr>
-        <w:t xml:space="preserve"> </w:t>
+        <w:t xml:space="preserve">, however, the difference is this time you are not assigning numbers, instead a bunch of </w:t>
+      </w:r>
+      <w:r>
+        <w:rPr>
+          <w:b/>
+          <w:bCs/>
+        </w:rPr>
+        <w:t xml:space="preserve">letters </w:t>
       </w:r>
       <w:r>
         <w:t xml:space="preserve">characters. </w:t>
@@ -2809,15 +2611,7 @@
       </w:r>
       <w:proofErr w:type="spellEnd"/>
       <w:r>
-        <w:t xml:space="preserve"> text.txt</w:t>
-      </w:r>
-      <w:proofErr w:type="gramStart"/>
-      <w:r>
-        <w:t>” ,</w:t>
-      </w:r>
-      <w:proofErr w:type="gramEnd"/>
-      <w:r>
-        <w:t xml:space="preserve"> you can see we are assigning “execute” permission to the user group of the file text.txt.</w:t>
+        <w:t xml:space="preserve"> text.txt” , you can see we are assigning “execute” permission to the user group of the file text.txt.</w:t>
       </w:r>
     </w:p>
     <w:p/>
@@ -2834,7 +2628,6 @@
         <w:pStyle w:val="Heading3"/>
         <w:jc w:val="center"/>
       </w:pPr>
-      <w:proofErr w:type="gramStart"/>
       <w:r>
         <w:t xml:space="preserve">text.txt </w:t>
       </w:r>
@@ -2843,7 +2636,6 @@
         <w:t>-</w:t>
       </w:r>
       <w:proofErr w:type="spellStart"/>
-      <w:proofErr w:type="gramEnd"/>
       <w:r>
         <w:t>rw</w:t>
       </w:r>
@@ -2882,7 +2674,6 @@
         <w:pStyle w:val="Heading3"/>
         <w:jc w:val="center"/>
       </w:pPr>
-      <w:proofErr w:type="gramStart"/>
       <w:r>
         <w:t xml:space="preserve">text.txt </w:t>
       </w:r>
@@ -2891,7 +2682,6 @@
         <w:t>-</w:t>
       </w:r>
       <w:proofErr w:type="spellStart"/>
-      <w:proofErr w:type="gramEnd"/>
       <w:r>
         <w:t>rwxrw</w:t>
       </w:r>
@@ -2970,7 +2760,6 @@
         <w:pStyle w:val="Heading3"/>
         <w:jc w:val="center"/>
       </w:pPr>
-      <w:proofErr w:type="gramStart"/>
       <w:r>
         <w:t xml:space="preserve">text.txt </w:t>
       </w:r>
@@ -2979,7 +2768,6 @@
         <w:t>-</w:t>
       </w:r>
       <w:proofErr w:type="spellStart"/>
-      <w:proofErr w:type="gramEnd"/>
       <w:r>
         <w:t>rw</w:t>
       </w:r>
@@ -3018,7 +2806,6 @@
         <w:pStyle w:val="Heading3"/>
         <w:jc w:val="center"/>
       </w:pPr>
-      <w:proofErr w:type="gramStart"/>
       <w:r>
         <w:t xml:space="preserve">text.txt </w:t>
       </w:r>
@@ -3027,7 +2814,6 @@
         <w:t>-</w:t>
       </w:r>
       <w:proofErr w:type="spellStart"/>
-      <w:proofErr w:type="gramEnd"/>
       <w:r>
         <w:t>rwxrw</w:t>
       </w:r>
@@ -3103,7 +2889,6 @@
         <w:pStyle w:val="Heading3"/>
         <w:jc w:val="center"/>
       </w:pPr>
-      <w:proofErr w:type="gramStart"/>
       <w:r>
         <w:t xml:space="preserve">text.txt </w:t>
       </w:r>
@@ -3112,7 +2897,6 @@
         <w:t>-</w:t>
       </w:r>
       <w:proofErr w:type="spellStart"/>
-      <w:proofErr w:type="gramEnd"/>
       <w:r>
         <w:t>rw</w:t>
       </w:r>
@@ -3151,7 +2935,6 @@
         <w:pStyle w:val="Heading3"/>
         <w:jc w:val="center"/>
       </w:pPr>
-      <w:proofErr w:type="gramStart"/>
       <w:r>
         <w:t xml:space="preserve">text.txt </w:t>
       </w:r>
@@ -3160,13 +2943,20 @@
         <w:t>-</w:t>
       </w:r>
       <w:proofErr w:type="spellStart"/>
-      <w:proofErr w:type="gramEnd"/>
       <w:r>
         <w:t>rwxr</w:t>
       </w:r>
       <w:proofErr w:type="spellEnd"/>
       <w:r>
-        <w:t>-xr-x</w:t>
+        <w:t>-</w:t>
+      </w:r>
+      <w:proofErr w:type="spellStart"/>
+      <w:r>
+        <w:t>xr</w:t>
+      </w:r>
+      <w:proofErr w:type="spellEnd"/>
+      <w:r>
+        <w:t>-x</w:t>
       </w:r>
     </w:p>
     <w:p/>
@@ -3370,7 +3160,6 @@
         <w:t xml:space="preserve"> </w:t>
       </w:r>
       <w:proofErr w:type="spellStart"/>
-      <w:proofErr w:type="gramStart"/>
       <w:r>
         <w:t>chown</w:t>
       </w:r>
@@ -3383,7 +3172,6 @@
         <w:t>mysql</w:t>
       </w:r>
       <w:proofErr w:type="spellEnd"/>
-      <w:proofErr w:type="gramEnd"/>
       <w:r>
         <w:t xml:space="preserve"> text.txt</w:t>
       </w:r>
@@ -3434,27 +3222,25 @@
         <w:t xml:space="preserve"> </w:t>
       </w:r>
       <w:proofErr w:type="spellStart"/>
+      <w:r>
+        <w:t>mysql:mysql</w:t>
+      </w:r>
+      <w:proofErr w:type="spellEnd"/>
+      <w:r>
+        <w:t xml:space="preserve"> text.txt</w:t>
+      </w:r>
+    </w:p>
+    <w:p/>
+    <w:p>
+      <w:r>
+        <w:t xml:space="preserve">The above command </w:t>
+      </w:r>
       <w:proofErr w:type="gramStart"/>
       <w:r>
-        <w:t>mysql:mysql</w:t>
-      </w:r>
-      <w:proofErr w:type="spellEnd"/>
+        <w:t>change</w:t>
+      </w:r>
       <w:proofErr w:type="gramEnd"/>
       <w:r>
-        <w:t xml:space="preserve"> text.txt</w:t>
-      </w:r>
-    </w:p>
-    <w:p/>
-    <w:p>
-      <w:r>
-        <w:t xml:space="preserve">The above command </w:t>
-      </w:r>
-      <w:proofErr w:type="gramStart"/>
-      <w:r>
-        <w:t>change</w:t>
-      </w:r>
-      <w:proofErr w:type="gramEnd"/>
-      <w:r>
         <w:t xml:space="preserve"> the user/owner and the group of the text file “text.txt” to </w:t>
       </w:r>
       <w:proofErr w:type="spellStart"/>
@@ -3486,15 +3272,7 @@
     </w:p>
     <w:p>
       <w:r>
-        <w:t xml:space="preserve">Specify which user </w:t>
-      </w:r>
-      <w:proofErr w:type="gramStart"/>
-      <w:r>
-        <w:t>sign-in</w:t>
-      </w:r>
-      <w:proofErr w:type="gramEnd"/>
-      <w:r>
-        <w:t xml:space="preserve"> the system.</w:t>
+        <w:t>Specify which user sign-in the system.</w:t>
       </w:r>
     </w:p>
     <w:p>
@@ -3553,15 +3331,7 @@
         <w:t xml:space="preserve">working directory </w:t>
       </w:r>
       <w:r>
-        <w:t xml:space="preserve">“you can check your working directory by the </w:t>
-      </w:r>
-      <w:proofErr w:type="spellStart"/>
-      <w:r>
-        <w:t>pwd</w:t>
-      </w:r>
-      <w:proofErr w:type="spellEnd"/>
-      <w:r>
-        <w:t xml:space="preserve"> command”.</w:t>
+        <w:t>“you can check your working directory by the pwd command”.</w:t>
       </w:r>
     </w:p>
     <w:p/>
@@ -3642,15 +3412,7 @@
         </w:numPr>
       </w:pPr>
       <w:r>
-        <w:t xml:space="preserve">Use </w:t>
-      </w:r>
-      <w:proofErr w:type="spellStart"/>
-      <w:r>
-        <w:t>pwd</w:t>
-      </w:r>
-      <w:proofErr w:type="spellEnd"/>
-      <w:r>
-        <w:t xml:space="preserve"> command to print the working directory</w:t>
+        <w:t>Use pwd command to print the working directory</w:t>
       </w:r>
     </w:p>
     <w:p>
@@ -3836,15 +3598,15 @@
         <w:t xml:space="preserve">Remember </w:t>
       </w:r>
       <w:r>
-        <w:t xml:space="preserve">a relative </w:t>
+        <w:t xml:space="preserve">a relative path </w:t>
       </w:r>
       <w:proofErr w:type="gramStart"/>
       <w:r>
-        <w:t>path is</w:t>
+        <w:t>is always relates</w:t>
       </w:r>
       <w:proofErr w:type="gramEnd"/>
       <w:r>
-        <w:t xml:space="preserve"> always relates to your working directory.</w:t>
+        <w:t xml:space="preserve"> to your working directory.</w:t>
       </w:r>
     </w:p>
     <w:p/>
@@ -3886,21 +3648,8 @@
       </w:r>
     </w:p>
     <w:p>
-      <w:proofErr w:type="gramStart"/>
-      <w:r>
-        <w:t>as</w:t>
-      </w:r>
-      <w:proofErr w:type="gramEnd"/>
-      <w:r>
-        <w:t xml:space="preserve"> shown </w:t>
-      </w:r>
-      <w:proofErr w:type="gramStart"/>
-      <w:r>
-        <w:t>above</w:t>
-      </w:r>
-      <w:proofErr w:type="gramEnd"/>
-      <w:r>
-        <w:t xml:space="preserve"> the remove command removes 2 </w:t>
+      <w:r>
+        <w:t xml:space="preserve">as shown above the remove command removes 2 </w:t>
       </w:r>
       <w:r>
         <w:rPr>
@@ -4254,15 +4003,7 @@
       </w:r>
       <w:proofErr w:type="spellEnd"/>
       <w:r>
-        <w:t xml:space="preserve">/code/version1/” to the relative path “code/version2”. </w:t>
-      </w:r>
-      <w:proofErr w:type="gramStart"/>
-      <w:r>
-        <w:t>when</w:t>
-      </w:r>
-      <w:proofErr w:type="gramEnd"/>
-      <w:r>
-        <w:t xml:space="preserve"> using the mv command, you need to provide the source and target location. Files will not remain in the source location when moved.</w:t>
+        <w:t>/code/version1/” to the relative path “code/version2”. when using the mv command, you need to provide the source and target location. Files will not remain in the source location when moved.</w:t>
       </w:r>
     </w:p>
     <w:p/>
@@ -4439,13 +4180,8 @@
       <w:pPr>
         <w:pStyle w:val="Heading2"/>
       </w:pPr>
-      <w:proofErr w:type="gramStart"/>
-      <w:r>
-        <w:t>- cp</w:t>
-      </w:r>
-      <w:proofErr w:type="gramEnd"/>
-      <w:r>
-        <w:t xml:space="preserve"> command</w:t>
+      <w:r>
+        <w:t>- cp command</w:t>
       </w:r>
     </w:p>
     <w:p>
@@ -4602,15 +4338,7 @@
         <w:t xml:space="preserve"> prompt a message </w:t>
       </w:r>
       <w:r>
-        <w:t>before copy/</w:t>
-      </w:r>
-      <w:proofErr w:type="gramStart"/>
-      <w:r>
-        <w:t>overwrite</w:t>
-      </w:r>
-      <w:proofErr w:type="gramEnd"/>
-      <w:r>
-        <w:t>. The “r” option indicates all the contents (including files and subdirectories) inside the “</w:t>
+        <w:t>before copy/overwrite. The “r” option indicates all the contents (including files and subdirectories) inside the “</w:t>
       </w:r>
       <w:proofErr w:type="spellStart"/>
       <w:r>
@@ -4695,15 +4423,7 @@
       </w:r>
       <w:proofErr w:type="gramEnd"/>
       <w:r>
-        <w:t xml:space="preserve"> in the source. System </w:t>
-      </w:r>
-      <w:proofErr w:type="gramStart"/>
-      <w:r>
-        <w:t>message</w:t>
-      </w:r>
-      <w:proofErr w:type="gramEnd"/>
-      <w:r>
-        <w:t xml:space="preserve"> will be prompt before copy/overwrite.  </w:t>
+        <w:t xml:space="preserve"> in the source. System message will be prompt before copy/overwrite.  </w:t>
       </w:r>
     </w:p>
     <w:p>
@@ -4735,7 +4455,7 @@
 </file>
 
 <file path=word/numbering.xml><?xml version="1.0" encoding="utf-8"?>
-<w:numbering xmlns:wpc="http://schemas.microsoft.com/office/word/2010/wordprocessingCanvas" xmlns:cx="http://schemas.microsoft.com/office/drawing/2014/chartex" xmlns:cx1="http://schemas.microsoft.com/office/drawing/2015/9/8/chartex" xmlns:cx2="http://schemas.microsoft.com/office/drawing/2015/10/21/chartex" xmlns:cx3="http://schemas.microsoft.com/office/drawing/2016/5/9/chartex" xmlns:cx4="http://schemas.microsoft.com/office/drawing/2016/5/10/chartex" xmlns:cx5="http://schemas.microsoft.com/office/drawing/2016/5/11/chartex" xmlns:cx6="http://schemas.microsoft.com/office/drawing/2016/5/12/chartex" xmlns:cx7="http://schemas.microsoft.com/office/drawing/2016/5/13/chartex" xmlns:cx8="http://schemas.microsoft.com/office/drawing/2016/5/14/chartex" xmlns:mc="http://schemas.openxmlformats.org/markup-compatibility/2006" xmlns:aink="http://schemas.microsoft.com/office/drawing/2016/ink" xmlns:am3d="http://schemas.microsoft.com/office/drawing/2017/model3d" xmlns:o="urn:schemas-microsoft-com:office:office" xmlns:oel="http://schemas.microsoft.com/office/2019/extlst" xmlns:r="http://schemas.openxmlformats.org/officeDocument/2006/relationships" xmlns:m="http://schemas.openxmlformats.org/officeDocument/2006/math" xmlns:v="urn:schemas-microsoft-com:vml" xmlns:wp14="http://schemas.microsoft.com/office/word/2010/wordprocessingDrawing" xmlns:wp="http://schemas.openxmlformats.org/drawingml/2006/wordprocessingDrawing" xmlns:w10="urn:schemas-microsoft-com:office:word" xmlns:w="http://schemas.openxmlformats.org/wordprocessingml/2006/main" xmlns:w14="http://schemas.microsoft.com/office/word/2010/wordml" xmlns:w15="http://schemas.microsoft.com/office/word/2012/wordml" xmlns:w16cex="http://schemas.microsoft.com/office/word/2018/wordml/cex" xmlns:w16cid="http://schemas.microsoft.com/office/word/2016/wordml/cid" xmlns:w16="http://schemas.microsoft.com/office/word/2018/wordml" xmlns:w16du="http://schemas.microsoft.com/office/word/2023/wordml/word16du" xmlns:w16sdtdh="http://schemas.microsoft.com/office/word/2020/wordml/sdtdatahash" xmlns:w16sdtfl="http://schemas.microsoft.com/office/word/2024/wordml/sdtformatlock" xmlns:w16se="http://schemas.microsoft.com/office/word/2015/wordml/symex" xmlns:wpg="http://schemas.microsoft.com/office/word/2010/wordprocessingGroup" xmlns:wpi="http://schemas.microsoft.com/office/word/2010/wordprocessingInk" xmlns:wne="http://schemas.microsoft.com/office/word/2006/wordml" xmlns:wps="http://schemas.microsoft.com/office/word/2010/wordprocessingShape" mc:Ignorable="w14 w15 w16se w16cid w16 w16cex w16sdtdh w16sdtfl w16du wp14">
+<w:numbering xmlns:wpc="http://schemas.microsoft.com/office/word/2010/wordprocessingCanvas" xmlns:cx="http://schemas.microsoft.com/office/drawing/2014/chartex" xmlns:cx1="http://schemas.microsoft.com/office/drawing/2015/9/8/chartex" xmlns:cx2="http://schemas.microsoft.com/office/drawing/2015/10/21/chartex" xmlns:cx3="http://schemas.microsoft.com/office/drawing/2016/5/9/chartex" xmlns:cx4="http://schemas.microsoft.com/office/drawing/2016/5/10/chartex" xmlns:cx5="http://schemas.microsoft.com/office/drawing/2016/5/11/chartex" xmlns:cx6="http://schemas.microsoft.com/office/drawing/2016/5/12/chartex" xmlns:cx7="http://schemas.microsoft.com/office/drawing/2016/5/13/chartex" xmlns:cx8="http://schemas.microsoft.com/office/drawing/2016/5/14/chartex" xmlns:mc="http://schemas.openxmlformats.org/markup-compatibility/2006" xmlns:m="http://schemas.openxmlformats.org/officeDocument/2006/math" xmlns:aink="http://schemas.microsoft.com/office/drawing/2016/ink" xmlns:am3d="http://schemas.microsoft.com/office/drawing/2017/model3d" xmlns:oel="http://schemas.microsoft.com/office/2019/extlst" xmlns:r="http://schemas.openxmlformats.org/officeDocument/2006/relationships" xmlns:wp14="http://schemas.microsoft.com/office/word/2010/wordprocessingDrawing" xmlns:wp="http://schemas.openxmlformats.org/drawingml/2006/wordprocessingDrawing" xmlns:wpg="http://schemas.microsoft.com/office/word/2010/wordprocessingGroup" xmlns:wpi="http://schemas.microsoft.com/office/word/2010/wordprocessingInk" xmlns:wps="http://schemas.microsoft.com/office/word/2010/wordprocessingShape" xmlns:o="urn:schemas-microsoft-com:office:office" xmlns:v="urn:schemas-microsoft-com:vml" xmlns:w10="urn:schemas-microsoft-com:office:word" xmlns:w="http://schemas.openxmlformats.org/wordprocessingml/2006/main" xmlns:w14="http://schemas.microsoft.com/office/word/2010/wordml" xmlns:w15="http://schemas.microsoft.com/office/word/2012/wordml" xmlns:w16cei="http://schemas.microsoft.com/office/word/2026/wordml/cei" xmlns:w16cex="http://schemas.microsoft.com/office/word/2018/wordml/cex" xmlns:w16cid="http://schemas.microsoft.com/office/word/2016/wordml/cid" xmlns:w16="http://schemas.microsoft.com/office/word/2018/wordml" xmlns:w16sdtdh="http://schemas.microsoft.com/office/word/2020/wordml/sdtdatahash" xmlns:w16sdtfl="http://schemas.microsoft.com/office/word/2024/wordml/sdtformatlock" xmlns:w16se="http://schemas.microsoft.com/office/word/2015/wordml/symex" xmlns:w16du="http://schemas.microsoft.com/office/word/2023/wordml/word16du" xmlns:wne="http://schemas.microsoft.com/office/word/2006/wordml" mc:Ignorable="w14 w15 w16se w16cid w16 w16cex w16sdtdh w16sdtfl w16du wp14">
   <w:abstractNum w:abstractNumId="0" w15:restartNumberingAfterBreak="0">
     <w:nsid w:val="808F6FE8"/>
     <w:multiLevelType w:val="multilevel"/>
@@ -4934,7 +4654,7 @@
 </file>
 
 <file path=word/styles.xml><?xml version="1.0" encoding="utf-8"?>
-<w:styles xmlns:mc="http://schemas.openxmlformats.org/markup-compatibility/2006" xmlns:r="http://schemas.openxmlformats.org/officeDocument/2006/relationships" xmlns:w="http://schemas.openxmlformats.org/wordprocessingml/2006/main" xmlns:w14="http://schemas.microsoft.com/office/word/2010/wordml" xmlns:w15="http://schemas.microsoft.com/office/word/2012/wordml" xmlns:w16cex="http://schemas.microsoft.com/office/word/2018/wordml/cex" xmlns:w16cid="http://schemas.microsoft.com/office/word/2016/wordml/cid" xmlns:w16="http://schemas.microsoft.com/office/word/2018/wordml" xmlns:w16du="http://schemas.microsoft.com/office/word/2023/wordml/word16du" xmlns:w16sdtdh="http://schemas.microsoft.com/office/word/2020/wordml/sdtdatahash" xmlns:w16sdtfl="http://schemas.microsoft.com/office/word/2024/wordml/sdtformatlock" xmlns:w16se="http://schemas.microsoft.com/office/word/2015/wordml/symex" mc:Ignorable="w14 w15 w16se w16cid w16 w16cex w16sdtdh w16sdtfl w16du">
+<w:styles xmlns:mc="http://schemas.openxmlformats.org/markup-compatibility/2006" xmlns:r="http://schemas.openxmlformats.org/officeDocument/2006/relationships" xmlns:w="http://schemas.openxmlformats.org/wordprocessingml/2006/main" xmlns:w14="http://schemas.microsoft.com/office/word/2010/wordml" xmlns:w15="http://schemas.microsoft.com/office/word/2012/wordml" xmlns:w16cex="http://schemas.microsoft.com/office/word/2018/wordml/cex" xmlns:w16cid="http://schemas.microsoft.com/office/word/2016/wordml/cid" xmlns:w16="http://schemas.microsoft.com/office/word/2018/wordml" xmlns:w16sdtdh="http://schemas.microsoft.com/office/word/2020/wordml/sdtdatahash" xmlns:w16sdtfl="http://schemas.microsoft.com/office/word/2024/wordml/sdtformatlock" xmlns:w16se="http://schemas.microsoft.com/office/word/2015/wordml/symex" xmlns:w16du="http://schemas.microsoft.com/office/word/2023/wordml/word16du" mc:Ignorable="w14 w15 w16se w16cid w16 w16cex w16sdtdh w16sdtfl w16du">
   <w:docDefaults>
     <w:rPrDefault>
       <w:rPr>

</xml_diff>